<commit_message>
Add comprehensive abbreviation glossary to manuscript and tables
</commit_message>
<xml_diff>
--- a/manuscript/Annual_ST_Editable_Tables.docx
+++ b/manuscript/Annual_ST_Editable_Tables.docx
@@ -8612,6 +8612,1671 @@
           <w:sz w:val="18"/>
         </w:rPr>
         <w:t>Source: Saved scores; each confusion matrix totals 216 records and 11 events. Logistic converged in 42 solver iterations; it has no neural epoch.</w:t>
+      </w:r>
+    </w:p>
+    <w:p>
+      <w:pPr>
+        <w:keepNext/>
+        <w:pageBreakBefore/>
+        <w:spacing w:after="120"/>
+      </w:pPr>
+      <w:r>
+        <w:rPr>
+          <w:rFonts w:ascii="Times New Roman" w:hAnsi="Times New Roman"/>
+          <w:b/>
+          <w:sz w:val="28"/>
+        </w:rPr>
+        <w:t>Appendix A Abbreviations and notation</w:t>
+      </w:r>
+    </w:p>
+    <w:p>
+      <w:pPr>
+        <w:keepNext/>
+        <w:spacing w:after="60"/>
+        <w:jc w:val="center"/>
+      </w:pPr>
+      <w:r>
+        <w:rPr>
+          <w:rFonts w:ascii="Times New Roman" w:hAnsi="Times New Roman"/>
+          <w:b/>
+          <w:sz w:val="22"/>
+        </w:rPr>
+        <w:t>Table A1: Abbreviations and notation</w:t>
+      </w:r>
+    </w:p>
+    <w:tbl>
+      <w:tblPr>
+        <w:tblW w:type="auto" w:w="0"/>
+        <w:tblLayout w:type="fixed"/>
+        <w:tblLook w:firstColumn="1" w:firstRow="1" w:lastColumn="0" w:lastRow="0" w:noHBand="0" w:noVBand="1" w:val="04A0"/>
+        <w:tblBorders>
+          <w:top w:val="single" w:sz="4" w:color="999999"/>
+          <w:left w:val="single" w:sz="4" w:color="999999"/>
+          <w:bottom w:val="single" w:sz="4" w:color="999999"/>
+          <w:right w:val="single" w:sz="4" w:color="999999"/>
+          <w:insideH w:val="single" w:sz="4" w:color="999999"/>
+          <w:insideV w:val="single" w:sz="4" w:color="999999"/>
+        </w:tblBorders>
+      </w:tblPr>
+      <w:tblGrid>
+        <w:gridCol w:w="1440"/>
+        <w:gridCol w:w="7920"/>
+      </w:tblGrid>
+      <w:tr>
+        <w:trPr>
+          <w:cantSplit/>
+          <w:tblHeader/>
+        </w:trPr>
+        <w:tc>
+          <w:tcPr>
+            <w:tcW w:type="dxa" w:w="1440"/>
+            <w:shd w:fill="EEEEEE"/>
+          </w:tcPr>
+          <w:p>
+            <w:pPr>
+              <w:spacing w:before="0" w:after="20" w:line="240" w:lineRule="auto"/>
+            </w:pPr>
+            <w:r>
+              <w:rPr>
+                <w:rFonts w:ascii="Times New Roman" w:hAnsi="Times New Roman"/>
+                <w:b/>
+                <w:sz w:val="20"/>
+              </w:rPr>
+              <w:t>Abbreviation / symbol</w:t>
+            </w:r>
+          </w:p>
+        </w:tc>
+        <w:tc>
+          <w:tcPr>
+            <w:tcW w:type="dxa" w:w="7920"/>
+            <w:shd w:fill="EEEEEE"/>
+          </w:tcPr>
+          <w:p>
+            <w:pPr>
+              <w:spacing w:before="0" w:after="20" w:line="240" w:lineRule="auto"/>
+            </w:pPr>
+            <w:r>
+              <w:rPr>
+                <w:rFonts w:ascii="Times New Roman" w:hAnsi="Times New Roman"/>
+                <w:b/>
+                <w:sz w:val="20"/>
+              </w:rPr>
+              <w:t>Full form or meaning</w:t>
+            </w:r>
+          </w:p>
+        </w:tc>
+      </w:tr>
+      <w:tr>
+        <w:trPr>
+          <w:cantSplit/>
+        </w:trPr>
+        <w:tc>
+          <w:tcPr>
+            <w:tcW w:type="dxa" w:w="1440"/>
+          </w:tcPr>
+          <w:p>
+            <w:pPr>
+              <w:spacing w:before="0" w:after="20" w:line="240" w:lineRule="auto"/>
+            </w:pPr>
+            <w:r>
+              <w:rPr>
+                <w:rFonts w:ascii="Times New Roman" w:hAnsi="Times New Roman"/>
+                <w:b w:val="0"/>
+                <w:sz w:val="20"/>
+              </w:rPr>
+              <w:t>ACL</w:t>
+            </w:r>
+          </w:p>
+        </w:tc>
+        <w:tc>
+          <w:tcPr>
+            <w:tcW w:type="dxa" w:w="7920"/>
+          </w:tcPr>
+          <w:p>
+            <w:pPr>
+              <w:spacing w:before="0" w:after="20" w:line="240" w:lineRule="auto"/>
+            </w:pPr>
+            <w:r>
+              <w:rPr>
+                <w:rFonts w:ascii="Times New Roman" w:hAnsi="Times New Roman"/>
+                <w:b w:val="0"/>
+                <w:sz w:val="20"/>
+              </w:rPr>
+              <w:t>Association for Computational Linguistics</w:t>
+            </w:r>
+          </w:p>
+        </w:tc>
+      </w:tr>
+      <w:tr>
+        <w:trPr>
+          <w:cantSplit/>
+        </w:trPr>
+        <w:tc>
+          <w:tcPr>
+            <w:tcW w:type="dxa" w:w="1440"/>
+          </w:tcPr>
+          <w:p>
+            <w:pPr>
+              <w:spacing w:before="0" w:after="20" w:line="240" w:lineRule="auto"/>
+            </w:pPr>
+            <w:r>
+              <w:rPr>
+                <w:rFonts w:ascii="Times New Roman" w:hAnsi="Times New Roman"/>
+                <w:b w:val="0"/>
+                <w:sz w:val="20"/>
+              </w:rPr>
+              <w:t>Adam</w:t>
+            </w:r>
+          </w:p>
+        </w:tc>
+        <w:tc>
+          <w:tcPr>
+            <w:tcW w:type="dxa" w:w="7920"/>
+          </w:tcPr>
+          <w:p>
+            <w:pPr>
+              <w:spacing w:before="0" w:after="20" w:line="240" w:lineRule="auto"/>
+            </w:pPr>
+            <w:r>
+              <w:rPr>
+                <w:rFonts w:ascii="Times New Roman" w:hAnsi="Times New Roman"/>
+                <w:b w:val="0"/>
+                <w:sz w:val="20"/>
+              </w:rPr>
+              <w:t>Adaptive moment estimation; neural optimizer</w:t>
+            </w:r>
+          </w:p>
+        </w:tc>
+      </w:tr>
+      <w:tr>
+        <w:trPr>
+          <w:cantSplit/>
+        </w:trPr>
+        <w:tc>
+          <w:tcPr>
+            <w:tcW w:type="dxa" w:w="1440"/>
+          </w:tcPr>
+          <w:p>
+            <w:pPr>
+              <w:spacing w:before="0" w:after="20" w:line="240" w:lineRule="auto"/>
+            </w:pPr>
+            <w:r>
+              <w:rPr>
+                <w:rFonts w:ascii="Times New Roman" w:hAnsi="Times New Roman"/>
+                <w:b w:val="0"/>
+                <w:sz w:val="20"/>
+              </w:rPr>
+              <w:t>AP</w:t>
+            </w:r>
+          </w:p>
+        </w:tc>
+        <w:tc>
+          <w:tcPr>
+            <w:tcW w:type="dxa" w:w="7920"/>
+          </w:tcPr>
+          <w:p>
+            <w:pPr>
+              <w:spacing w:before="0" w:after="20" w:line="240" w:lineRule="auto"/>
+            </w:pPr>
+            <w:r>
+              <w:rPr>
+                <w:rFonts w:ascii="Times New Roman" w:hAnsi="Times New Roman"/>
+                <w:b w:val="0"/>
+                <w:sz w:val="20"/>
+              </w:rPr>
+              <w:t>Average precision; recall-weighted precision</w:t>
+            </w:r>
+          </w:p>
+        </w:tc>
+      </w:tr>
+      <w:tr>
+        <w:trPr>
+          <w:cantSplit/>
+        </w:trPr>
+        <w:tc>
+          <w:tcPr>
+            <w:tcW w:type="dxa" w:w="1440"/>
+          </w:tcPr>
+          <w:p>
+            <w:pPr>
+              <w:spacing w:before="0" w:after="20" w:line="240" w:lineRule="auto"/>
+            </w:pPr>
+            <w:r>
+              <w:rPr>
+                <w:rFonts w:ascii="Times New Roman" w:hAnsi="Times New Roman"/>
+                <w:b w:val="0"/>
+                <w:sz w:val="20"/>
+              </w:rPr>
+              <w:t>AR/A</w:t>
+            </w:r>
+          </w:p>
+        </w:tc>
+        <w:tc>
+          <w:tcPr>
+            <w:tcW w:type="dxa" w:w="7920"/>
+          </w:tcPr>
+          <w:p>
+            <w:pPr>
+              <w:spacing w:before="0" w:after="20" w:line="240" w:lineRule="auto"/>
+            </w:pPr>
+            <w:r>
+              <w:rPr>
+                <w:rFonts w:ascii="Times New Roman" w:hAnsi="Times New Roman"/>
+                <w:b w:val="0"/>
+                <w:sz w:val="20"/>
+              </w:rPr>
+              <w:t>Accounts receivable / assets</w:t>
+            </w:r>
+          </w:p>
+        </w:tc>
+      </w:tr>
+      <w:tr>
+        <w:trPr>
+          <w:cantSplit/>
+        </w:trPr>
+        <w:tc>
+          <w:tcPr>
+            <w:tcW w:type="dxa" w:w="1440"/>
+          </w:tcPr>
+          <w:p>
+            <w:pPr>
+              <w:spacing w:before="0" w:after="20" w:line="240" w:lineRule="auto"/>
+            </w:pPr>
+            <w:r>
+              <w:rPr>
+                <w:rFonts w:ascii="Times New Roman" w:hAnsi="Times New Roman"/>
+                <w:b w:val="0"/>
+                <w:sz w:val="20"/>
+              </w:rPr>
+              <w:t>AUC</w:t>
+            </w:r>
+          </w:p>
+        </w:tc>
+        <w:tc>
+          <w:tcPr>
+            <w:tcW w:type="dxa" w:w="7920"/>
+          </w:tcPr>
+          <w:p>
+            <w:pPr>
+              <w:spacing w:before="0" w:after="20" w:line="240" w:lineRule="auto"/>
+            </w:pPr>
+            <w:r>
+              <w:rPr>
+                <w:rFonts w:ascii="Times New Roman" w:hAnsi="Times New Roman"/>
+                <w:b w:val="0"/>
+                <w:sz w:val="20"/>
+              </w:rPr>
+              <w:t>Area under the curve; here, the ROC curve</w:t>
+            </w:r>
+          </w:p>
+        </w:tc>
+      </w:tr>
+      <w:tr>
+        <w:trPr>
+          <w:cantSplit/>
+        </w:trPr>
+        <w:tc>
+          <w:tcPr>
+            <w:tcW w:type="dxa" w:w="1440"/>
+          </w:tcPr>
+          <w:p>
+            <w:pPr>
+              <w:spacing w:before="0" w:after="20" w:line="240" w:lineRule="auto"/>
+            </w:pPr>
+            <w:r>
+              <w:rPr>
+                <w:rFonts w:ascii="Times New Roman" w:hAnsi="Times New Roman"/>
+                <w:b w:val="0"/>
+                <w:sz w:val="20"/>
+              </w:rPr>
+              <w:t>BCE</w:t>
+            </w:r>
+          </w:p>
+        </w:tc>
+        <w:tc>
+          <w:tcPr>
+            <w:tcW w:type="dxa" w:w="7920"/>
+          </w:tcPr>
+          <w:p>
+            <w:pPr>
+              <w:spacing w:before="0" w:after="20" w:line="240" w:lineRule="auto"/>
+            </w:pPr>
+            <w:r>
+              <w:rPr>
+                <w:rFonts w:ascii="Times New Roman" w:hAnsi="Times New Roman"/>
+                <w:b w:val="0"/>
+                <w:sz w:val="20"/>
+              </w:rPr>
+              <w:t>Binary cross-entropy; training loss</w:t>
+            </w:r>
+          </w:p>
+        </w:tc>
+      </w:tr>
+      <w:tr>
+        <w:trPr>
+          <w:cantSplit/>
+        </w:trPr>
+        <w:tc>
+          <w:tcPr>
+            <w:tcW w:type="dxa" w:w="1440"/>
+          </w:tcPr>
+          <w:p>
+            <w:pPr>
+              <w:spacing w:before="0" w:after="20" w:line="240" w:lineRule="auto"/>
+            </w:pPr>
+            <w:r>
+              <w:rPr>
+                <w:rFonts w:ascii="Times New Roman" w:hAnsi="Times New Roman"/>
+                <w:b w:val="0"/>
+                <w:sz w:val="20"/>
+              </w:rPr>
+              <w:t>C</w:t>
+            </w:r>
+          </w:p>
+        </w:tc>
+        <w:tc>
+          <w:tcPr>
+            <w:tcW w:type="dxa" w:w="7920"/>
+          </w:tcPr>
+          <w:p>
+            <w:pPr>
+              <w:spacing w:before="0" w:after="20" w:line="240" w:lineRule="auto"/>
+            </w:pPr>
+            <w:r>
+              <w:rPr>
+                <w:rFonts w:ascii="Times New Roman" w:hAnsi="Times New Roman"/>
+                <w:b w:val="0"/>
+                <w:sz w:val="20"/>
+              </w:rPr>
+              <w:t>Inverse regularization strength in logistic regression</w:t>
+            </w:r>
+          </w:p>
+        </w:tc>
+      </w:tr>
+      <w:tr>
+        <w:trPr>
+          <w:cantSplit/>
+        </w:trPr>
+        <w:tc>
+          <w:tcPr>
+            <w:tcW w:type="dxa" w:w="1440"/>
+          </w:tcPr>
+          <w:p>
+            <w:pPr>
+              <w:spacing w:before="0" w:after="20" w:line="240" w:lineRule="auto"/>
+            </w:pPr>
+            <w:r>
+              <w:rPr>
+                <w:rFonts w:ascii="Times New Roman" w:hAnsi="Times New Roman"/>
+                <w:b w:val="0"/>
+                <w:sz w:val="20"/>
+              </w:rPr>
+              <w:t>CI</w:t>
+            </w:r>
+          </w:p>
+        </w:tc>
+        <w:tc>
+          <w:tcPr>
+            <w:tcW w:type="dxa" w:w="7920"/>
+          </w:tcPr>
+          <w:p>
+            <w:pPr>
+              <w:spacing w:before="0" w:after="20" w:line="240" w:lineRule="auto"/>
+            </w:pPr>
+            <w:r>
+              <w:rPr>
+                <w:rFonts w:ascii="Times New Roman" w:hAnsi="Times New Roman"/>
+                <w:b w:val="0"/>
+                <w:sz w:val="20"/>
+              </w:rPr>
+              <w:t>Confidence interval</w:t>
+            </w:r>
+          </w:p>
+        </w:tc>
+      </w:tr>
+      <w:tr>
+        <w:trPr>
+          <w:cantSplit/>
+        </w:trPr>
+        <w:tc>
+          <w:tcPr>
+            <w:tcW w:type="dxa" w:w="1440"/>
+          </w:tcPr>
+          <w:p>
+            <w:pPr>
+              <w:spacing w:before="0" w:after="20" w:line="240" w:lineRule="auto"/>
+            </w:pPr>
+            <w:r>
+              <w:rPr>
+                <w:rFonts w:ascii="Times New Roman" w:hAnsi="Times New Roman"/>
+                <w:b w:val="0"/>
+                <w:sz w:val="20"/>
+              </w:rPr>
+              <w:t>CR</w:t>
+            </w:r>
+          </w:p>
+        </w:tc>
+        <w:tc>
+          <w:tcPr>
+            <w:tcW w:type="dxa" w:w="7920"/>
+          </w:tcPr>
+          <w:p>
+            <w:pPr>
+              <w:spacing w:before="0" w:after="20" w:line="240" w:lineRule="auto"/>
+            </w:pPr>
+            <w:r>
+              <w:rPr>
+                <w:rFonts w:ascii="Times New Roman" w:hAnsi="Times New Roman"/>
+                <w:b w:val="0"/>
+                <w:sz w:val="20"/>
+              </w:rPr>
+              <w:t>Current ratio; current assets / current liabilities</w:t>
+            </w:r>
+          </w:p>
+        </w:tc>
+      </w:tr>
+      <w:tr>
+        <w:trPr>
+          <w:cantSplit/>
+        </w:trPr>
+        <w:tc>
+          <w:tcPr>
+            <w:tcW w:type="dxa" w:w="1440"/>
+          </w:tcPr>
+          <w:p>
+            <w:pPr>
+              <w:spacing w:before="0" w:after="20" w:line="240" w:lineRule="auto"/>
+            </w:pPr>
+            <w:r>
+              <w:rPr>
+                <w:rFonts w:ascii="Times New Roman" w:hAnsi="Times New Roman"/>
+                <w:b w:val="0"/>
+                <w:sz w:val="20"/>
+              </w:rPr>
+              <w:t>F1</w:t>
+            </w:r>
+          </w:p>
+        </w:tc>
+        <w:tc>
+          <w:tcPr>
+            <w:tcW w:type="dxa" w:w="7920"/>
+          </w:tcPr>
+          <w:p>
+            <w:pPr>
+              <w:spacing w:before="0" w:after="20" w:line="240" w:lineRule="auto"/>
+            </w:pPr>
+            <w:r>
+              <w:rPr>
+                <w:rFonts w:ascii="Times New Roman" w:hAnsi="Times New Roman"/>
+                <w:b w:val="0"/>
+                <w:sz w:val="20"/>
+              </w:rPr>
+              <w:t>Harmonic mean of precision and recall</w:t>
+            </w:r>
+          </w:p>
+        </w:tc>
+      </w:tr>
+      <w:tr>
+        <w:trPr>
+          <w:cantSplit/>
+        </w:trPr>
+        <w:tc>
+          <w:tcPr>
+            <w:tcW w:type="dxa" w:w="1440"/>
+          </w:tcPr>
+          <w:p>
+            <w:pPr>
+              <w:spacing w:before="0" w:after="20" w:line="240" w:lineRule="auto"/>
+            </w:pPr>
+            <w:r>
+              <w:rPr>
+                <w:rFonts w:ascii="Times New Roman" w:hAnsi="Times New Roman"/>
+                <w:b w:val="0"/>
+                <w:sz w:val="20"/>
+              </w:rPr>
+              <w:t>FN</w:t>
+            </w:r>
+          </w:p>
+        </w:tc>
+        <w:tc>
+          <w:tcPr>
+            <w:tcW w:type="dxa" w:w="7920"/>
+          </w:tcPr>
+          <w:p>
+            <w:pPr>
+              <w:spacing w:before="0" w:after="20" w:line="240" w:lineRule="auto"/>
+            </w:pPr>
+            <w:r>
+              <w:rPr>
+                <w:rFonts w:ascii="Times New Roman" w:hAnsi="Times New Roman"/>
+                <w:b w:val="0"/>
+                <w:sz w:val="20"/>
+              </w:rPr>
+              <w:t>False negatives; missed events</w:t>
+            </w:r>
+          </w:p>
+        </w:tc>
+      </w:tr>
+      <w:tr>
+        <w:trPr>
+          <w:cantSplit/>
+        </w:trPr>
+        <w:tc>
+          <w:tcPr>
+            <w:tcW w:type="dxa" w:w="1440"/>
+          </w:tcPr>
+          <w:p>
+            <w:pPr>
+              <w:spacing w:before="0" w:after="20" w:line="240" w:lineRule="auto"/>
+            </w:pPr>
+            <w:r>
+              <w:rPr>
+                <w:rFonts w:ascii="Times New Roman" w:hAnsi="Times New Roman"/>
+                <w:b w:val="0"/>
+                <w:sz w:val="20"/>
+              </w:rPr>
+              <w:t>FP</w:t>
+            </w:r>
+          </w:p>
+        </w:tc>
+        <w:tc>
+          <w:tcPr>
+            <w:tcW w:type="dxa" w:w="7920"/>
+          </w:tcPr>
+          <w:p>
+            <w:pPr>
+              <w:spacing w:before="0" w:after="20" w:line="240" w:lineRule="auto"/>
+            </w:pPr>
+            <w:r>
+              <w:rPr>
+                <w:rFonts w:ascii="Times New Roman" w:hAnsi="Times New Roman"/>
+                <w:b w:val="0"/>
+                <w:sz w:val="20"/>
+              </w:rPr>
+              <w:t>False positives; false alerts</w:t>
+            </w:r>
+          </w:p>
+        </w:tc>
+      </w:tr>
+      <w:tr>
+        <w:trPr>
+          <w:cantSplit/>
+        </w:trPr>
+        <w:tc>
+          <w:tcPr>
+            <w:tcW w:type="dxa" w:w="1440"/>
+          </w:tcPr>
+          <w:p>
+            <w:pPr>
+              <w:spacing w:before="0" w:after="20" w:line="240" w:lineRule="auto"/>
+            </w:pPr>
+            <w:r>
+              <w:rPr>
+                <w:rFonts w:ascii="Times New Roman" w:hAnsi="Times New Roman"/>
+                <w:b w:val="0"/>
+                <w:sz w:val="20"/>
+              </w:rPr>
+              <w:t>INV/A</w:t>
+            </w:r>
+          </w:p>
+        </w:tc>
+        <w:tc>
+          <w:tcPr>
+            <w:tcW w:type="dxa" w:w="7920"/>
+          </w:tcPr>
+          <w:p>
+            <w:pPr>
+              <w:spacing w:before="0" w:after="20" w:line="240" w:lineRule="auto"/>
+            </w:pPr>
+            <w:r>
+              <w:rPr>
+                <w:rFonts w:ascii="Times New Roman" w:hAnsi="Times New Roman"/>
+                <w:b w:val="0"/>
+                <w:sz w:val="20"/>
+              </w:rPr>
+              <w:t>Inventory / assets</w:t>
+            </w:r>
+          </w:p>
+        </w:tc>
+      </w:tr>
+      <w:tr>
+        <w:trPr>
+          <w:cantSplit/>
+        </w:trPr>
+        <w:tc>
+          <w:tcPr>
+            <w:tcW w:type="dxa" w:w="1440"/>
+          </w:tcPr>
+          <w:p>
+            <w:pPr>
+              <w:spacing w:before="0" w:after="20" w:line="240" w:lineRule="auto"/>
+            </w:pPr>
+            <w:r>
+              <w:rPr>
+                <w:rFonts w:ascii="Times New Roman" w:hAnsi="Times New Roman"/>
+                <w:b w:val="0"/>
+                <w:sz w:val="20"/>
+              </w:rPr>
+              <w:t>JEL</w:t>
+            </w:r>
+          </w:p>
+        </w:tc>
+        <w:tc>
+          <w:tcPr>
+            <w:tcW w:type="dxa" w:w="7920"/>
+          </w:tcPr>
+          <w:p>
+            <w:pPr>
+              <w:spacing w:before="0" w:after="20" w:line="240" w:lineRule="auto"/>
+            </w:pPr>
+            <w:r>
+              <w:rPr>
+                <w:rFonts w:ascii="Times New Roman" w:hAnsi="Times New Roman"/>
+                <w:b w:val="0"/>
+                <w:sz w:val="20"/>
+              </w:rPr>
+              <w:t>Journal of Economic Literature classification</w:t>
+            </w:r>
+          </w:p>
+        </w:tc>
+      </w:tr>
+      <w:tr>
+        <w:trPr>
+          <w:cantSplit/>
+        </w:trPr>
+        <w:tc>
+          <w:tcPr>
+            <w:tcW w:type="dxa" w:w="1440"/>
+          </w:tcPr>
+          <w:p>
+            <w:pPr>
+              <w:spacing w:before="0" w:after="20" w:line="240" w:lineRule="auto"/>
+            </w:pPr>
+            <w:r>
+              <w:rPr>
+                <w:rFonts w:ascii="Times New Roman" w:hAnsi="Times New Roman"/>
+                <w:b w:val="0"/>
+                <w:sz w:val="20"/>
+              </w:rPr>
+              <w:t>L/A</w:t>
+            </w:r>
+          </w:p>
+        </w:tc>
+        <w:tc>
+          <w:tcPr>
+            <w:tcW w:type="dxa" w:w="7920"/>
+          </w:tcPr>
+          <w:p>
+            <w:pPr>
+              <w:spacing w:before="0" w:after="20" w:line="240" w:lineRule="auto"/>
+            </w:pPr>
+            <w:r>
+              <w:rPr>
+                <w:rFonts w:ascii="Times New Roman" w:hAnsi="Times New Roman"/>
+                <w:b w:val="0"/>
+                <w:sz w:val="20"/>
+              </w:rPr>
+              <w:t>Liabilities / assets</w:t>
+            </w:r>
+          </w:p>
+        </w:tc>
+      </w:tr>
+      <w:tr>
+        <w:trPr>
+          <w:cantSplit/>
+        </w:trPr>
+        <w:tc>
+          <w:tcPr>
+            <w:tcW w:type="dxa" w:w="1440"/>
+          </w:tcPr>
+          <w:p>
+            <w:pPr>
+              <w:spacing w:before="0" w:after="20" w:line="240" w:lineRule="auto"/>
+            </w:pPr>
+            <w:r>
+              <w:rPr>
+                <w:rFonts w:ascii="Times New Roman" w:hAnsi="Times New Roman"/>
+                <w:b w:val="0"/>
+                <w:sz w:val="20"/>
+              </w:rPr>
+              <w:t>L2</w:t>
+            </w:r>
+          </w:p>
+        </w:tc>
+        <w:tc>
+          <w:tcPr>
+            <w:tcW w:type="dxa" w:w="7920"/>
+          </w:tcPr>
+          <w:p>
+            <w:pPr>
+              <w:spacing w:before="0" w:after="20" w:line="240" w:lineRule="auto"/>
+            </w:pPr>
+            <w:r>
+              <w:rPr>
+                <w:rFonts w:ascii="Times New Roman" w:hAnsi="Times New Roman"/>
+                <w:b w:val="0"/>
+                <w:sz w:val="20"/>
+              </w:rPr>
+              <w:t>Squared-coefficient regularization penalty</w:t>
+            </w:r>
+          </w:p>
+        </w:tc>
+      </w:tr>
+      <w:tr>
+        <w:trPr>
+          <w:cantSplit/>
+        </w:trPr>
+        <w:tc>
+          <w:tcPr>
+            <w:tcW w:type="dxa" w:w="1440"/>
+          </w:tcPr>
+          <w:p>
+            <w:pPr>
+              <w:spacing w:before="0" w:after="20" w:line="240" w:lineRule="auto"/>
+            </w:pPr>
+            <w:r>
+              <w:rPr>
+                <w:rFonts w:ascii="Times New Roman" w:hAnsi="Times New Roman"/>
+                <w:b w:val="0"/>
+                <w:sz w:val="20"/>
+              </w:rPr>
+              <w:t>lbfgs</w:t>
+            </w:r>
+          </w:p>
+        </w:tc>
+        <w:tc>
+          <w:tcPr>
+            <w:tcW w:type="dxa" w:w="7920"/>
+          </w:tcPr>
+          <w:p>
+            <w:pPr>
+              <w:spacing w:before="0" w:after="20" w:line="240" w:lineRule="auto"/>
+            </w:pPr>
+            <w:r>
+              <w:rPr>
+                <w:rFonts w:ascii="Times New Roman" w:hAnsi="Times New Roman"/>
+                <w:b w:val="0"/>
+                <w:sz w:val="20"/>
+              </w:rPr>
+              <w:t>Limited-memory Broyden–Fletcher–Goldfarb–Shanno solver</w:t>
+            </w:r>
+          </w:p>
+        </w:tc>
+      </w:tr>
+      <w:tr>
+        <w:trPr>
+          <w:cantSplit/>
+        </w:trPr>
+        <w:tc>
+          <w:tcPr>
+            <w:tcW w:type="dxa" w:w="1440"/>
+          </w:tcPr>
+          <w:p>
+            <w:pPr>
+              <w:spacing w:before="0" w:after="20" w:line="240" w:lineRule="auto"/>
+            </w:pPr>
+            <w:r>
+              <w:rPr>
+                <w:rFonts w:ascii="Times New Roman" w:hAnsi="Times New Roman"/>
+                <w:b w:val="0"/>
+                <w:sz w:val="20"/>
+              </w:rPr>
+              <w:t>MD&amp;A</w:t>
+            </w:r>
+          </w:p>
+        </w:tc>
+        <w:tc>
+          <w:tcPr>
+            <w:tcW w:type="dxa" w:w="7920"/>
+          </w:tcPr>
+          <w:p>
+            <w:pPr>
+              <w:spacing w:before="0" w:after="20" w:line="240" w:lineRule="auto"/>
+            </w:pPr>
+            <w:r>
+              <w:rPr>
+                <w:rFonts w:ascii="Times New Roman" w:hAnsi="Times New Roman"/>
+                <w:b w:val="0"/>
+                <w:sz w:val="20"/>
+              </w:rPr>
+              <w:t>Management discussion and analysis</w:t>
+            </w:r>
+          </w:p>
+        </w:tc>
+      </w:tr>
+      <w:tr>
+        <w:trPr>
+          <w:cantSplit/>
+        </w:trPr>
+        <w:tc>
+          <w:tcPr>
+            <w:tcW w:type="dxa" w:w="1440"/>
+          </w:tcPr>
+          <w:p>
+            <w:pPr>
+              <w:spacing w:before="0" w:after="20" w:line="240" w:lineRule="auto"/>
+            </w:pPr>
+            <w:r>
+              <w:rPr>
+                <w:rFonts w:ascii="Times New Roman" w:hAnsi="Times New Roman"/>
+                <w:b w:val="0"/>
+                <w:sz w:val="20"/>
+              </w:rPr>
+              <w:t>ME/R</w:t>
+            </w:r>
+          </w:p>
+        </w:tc>
+        <w:tc>
+          <w:tcPr>
+            <w:tcW w:type="dxa" w:w="7920"/>
+          </w:tcPr>
+          <w:p>
+            <w:pPr>
+              <w:spacing w:before="0" w:after="20" w:line="240" w:lineRule="auto"/>
+            </w:pPr>
+            <w:r>
+              <w:rPr>
+                <w:rFonts w:ascii="Times New Roman" w:hAnsi="Times New Roman"/>
+                <w:b w:val="0"/>
+                <w:sz w:val="20"/>
+              </w:rPr>
+              <w:t>Management expenses / revenue</w:t>
+            </w:r>
+          </w:p>
+        </w:tc>
+      </w:tr>
+      <w:tr>
+        <w:trPr>
+          <w:cantSplit/>
+        </w:trPr>
+        <w:tc>
+          <w:tcPr>
+            <w:tcW w:type="dxa" w:w="1440"/>
+          </w:tcPr>
+          <w:p>
+            <w:pPr>
+              <w:spacing w:before="0" w:after="20" w:line="240" w:lineRule="auto"/>
+            </w:pPr>
+            <w:r>
+              <w:rPr>
+                <w:rFonts w:ascii="Times New Roman" w:hAnsi="Times New Roman"/>
+                <w:b w:val="0"/>
+                <w:sz w:val="20"/>
+              </w:rPr>
+              <w:t>n</w:t>
+            </w:r>
+          </w:p>
+        </w:tc>
+        <w:tc>
+          <w:tcPr>
+            <w:tcW w:type="dxa" w:w="7920"/>
+          </w:tcPr>
+          <w:p>
+            <w:pPr>
+              <w:spacing w:before="0" w:after="20" w:line="240" w:lineRule="auto"/>
+            </w:pPr>
+            <w:r>
+              <w:rPr>
+                <w:rFonts w:ascii="Times New Roman" w:hAnsi="Times New Roman"/>
+                <w:b w:val="0"/>
+                <w:sz w:val="20"/>
+              </w:rPr>
+              <w:t>Number of observations</w:t>
+            </w:r>
+          </w:p>
+        </w:tc>
+      </w:tr>
+      <w:tr>
+        <w:trPr>
+          <w:cantSplit/>
+        </w:trPr>
+        <w:tc>
+          <w:tcPr>
+            <w:tcW w:type="dxa" w:w="1440"/>
+          </w:tcPr>
+          <w:p>
+            <w:pPr>
+              <w:spacing w:before="0" w:after="20" w:line="240" w:lineRule="auto"/>
+            </w:pPr>
+            <w:r>
+              <w:rPr>
+                <w:rFonts w:ascii="Times New Roman" w:hAnsi="Times New Roman"/>
+                <w:b w:val="0"/>
+                <w:sz w:val="20"/>
+              </w:rPr>
+              <w:t>NM</w:t>
+            </w:r>
+          </w:p>
+        </w:tc>
+        <w:tc>
+          <w:tcPr>
+            <w:tcW w:type="dxa" w:w="7920"/>
+          </w:tcPr>
+          <w:p>
+            <w:pPr>
+              <w:spacing w:before="0" w:after="20" w:line="240" w:lineRule="auto"/>
+            </w:pPr>
+            <w:r>
+              <w:rPr>
+                <w:rFonts w:ascii="Times New Roman" w:hAnsi="Times New Roman"/>
+                <w:b w:val="0"/>
+                <w:sz w:val="20"/>
+              </w:rPr>
+              <w:t>Net margin; consolidated net profit / revenue</w:t>
+            </w:r>
+          </w:p>
+        </w:tc>
+      </w:tr>
+      <w:tr>
+        <w:trPr>
+          <w:cantSplit/>
+        </w:trPr>
+        <w:tc>
+          <w:tcPr>
+            <w:tcW w:type="dxa" w:w="1440"/>
+          </w:tcPr>
+          <w:p>
+            <w:pPr>
+              <w:spacing w:before="0" w:after="20" w:line="240" w:lineRule="auto"/>
+            </w:pPr>
+            <w:r>
+              <w:rPr>
+                <w:rFonts w:ascii="Times New Roman" w:hAnsi="Times New Roman"/>
+                <w:b w:val="0"/>
+                <w:sz w:val="20"/>
+              </w:rPr>
+              <w:t>NP/A</w:t>
+            </w:r>
+          </w:p>
+        </w:tc>
+        <w:tc>
+          <w:tcPr>
+            <w:tcW w:type="dxa" w:w="7920"/>
+          </w:tcPr>
+          <w:p>
+            <w:pPr>
+              <w:spacing w:before="0" w:after="20" w:line="240" w:lineRule="auto"/>
+            </w:pPr>
+            <w:r>
+              <w:rPr>
+                <w:rFonts w:ascii="Times New Roman" w:hAnsi="Times New Roman"/>
+                <w:b w:val="0"/>
+                <w:sz w:val="20"/>
+              </w:rPr>
+              <w:t>Consolidated net profit / year-end assets</w:t>
+            </w:r>
+          </w:p>
+        </w:tc>
+      </w:tr>
+      <w:tr>
+        <w:trPr>
+          <w:cantSplit/>
+        </w:trPr>
+        <w:tc>
+          <w:tcPr>
+            <w:tcW w:type="dxa" w:w="1440"/>
+          </w:tcPr>
+          <w:p>
+            <w:pPr>
+              <w:spacing w:before="0" w:after="20" w:line="240" w:lineRule="auto"/>
+            </w:pPr>
+            <w:r>
+              <w:rPr>
+                <w:rFonts w:ascii="Times New Roman" w:hAnsi="Times New Roman"/>
+                <w:b w:val="0"/>
+                <w:sz w:val="20"/>
+              </w:rPr>
+              <w:t>NP/E</w:t>
+            </w:r>
+          </w:p>
+        </w:tc>
+        <w:tc>
+          <w:tcPr>
+            <w:tcW w:type="dxa" w:w="7920"/>
+          </w:tcPr>
+          <w:p>
+            <w:pPr>
+              <w:spacing w:before="0" w:after="20" w:line="240" w:lineRule="auto"/>
+            </w:pPr>
+            <w:r>
+              <w:rPr>
+                <w:rFonts w:ascii="Times New Roman" w:hAnsi="Times New Roman"/>
+                <w:b w:val="0"/>
+                <w:sz w:val="20"/>
+              </w:rPr>
+              <w:t>Consolidated net profit / year-end equity</w:t>
+            </w:r>
+          </w:p>
+        </w:tc>
+      </w:tr>
+      <w:tr>
+        <w:trPr>
+          <w:cantSplit/>
+        </w:trPr>
+        <w:tc>
+          <w:tcPr>
+            <w:tcW w:type="dxa" w:w="1440"/>
+          </w:tcPr>
+          <w:p>
+            <w:pPr>
+              <w:spacing w:before="0" w:after="20" w:line="240" w:lineRule="auto"/>
+            </w:pPr>
+            <w:r>
+              <w:rPr>
+                <w:rFonts w:ascii="Times New Roman" w:hAnsi="Times New Roman"/>
+                <w:b w:val="0"/>
+                <w:sz w:val="20"/>
+              </w:rPr>
+              <w:t>OCF/A</w:t>
+            </w:r>
+          </w:p>
+        </w:tc>
+        <w:tc>
+          <w:tcPr>
+            <w:tcW w:type="dxa" w:w="7920"/>
+          </w:tcPr>
+          <w:p>
+            <w:pPr>
+              <w:spacing w:before="0" w:after="20" w:line="240" w:lineRule="auto"/>
+            </w:pPr>
+            <w:r>
+              <w:rPr>
+                <w:rFonts w:ascii="Times New Roman" w:hAnsi="Times New Roman"/>
+                <w:b w:val="0"/>
+                <w:sz w:val="20"/>
+              </w:rPr>
+              <w:t>Operating cash flow / assets</w:t>
+            </w:r>
+          </w:p>
+        </w:tc>
+      </w:tr>
+      <w:tr>
+        <w:trPr>
+          <w:cantSplit/>
+        </w:trPr>
+        <w:tc>
+          <w:tcPr>
+            <w:tcW w:type="dxa" w:w="1440"/>
+          </w:tcPr>
+          <w:p>
+            <w:pPr>
+              <w:spacing w:before="0" w:after="20" w:line="240" w:lineRule="auto"/>
+            </w:pPr>
+            <w:r>
+              <w:rPr>
+                <w:rFonts w:ascii="Times New Roman" w:hAnsi="Times New Roman"/>
+                <w:b w:val="0"/>
+                <w:sz w:val="20"/>
+              </w:rPr>
+              <w:t>OCF/CL</w:t>
+            </w:r>
+          </w:p>
+        </w:tc>
+        <w:tc>
+          <w:tcPr>
+            <w:tcW w:type="dxa" w:w="7920"/>
+          </w:tcPr>
+          <w:p>
+            <w:pPr>
+              <w:spacing w:before="0" w:after="20" w:line="240" w:lineRule="auto"/>
+            </w:pPr>
+            <w:r>
+              <w:rPr>
+                <w:rFonts w:ascii="Times New Roman" w:hAnsi="Times New Roman"/>
+                <w:b w:val="0"/>
+                <w:sz w:val="20"/>
+              </w:rPr>
+              <w:t>Operating cash flow / current liabilities</w:t>
+            </w:r>
+          </w:p>
+        </w:tc>
+      </w:tr>
+      <w:tr>
+        <w:trPr>
+          <w:cantSplit/>
+        </w:trPr>
+        <w:tc>
+          <w:tcPr>
+            <w:tcW w:type="dxa" w:w="1440"/>
+          </w:tcPr>
+          <w:p>
+            <w:pPr>
+              <w:spacing w:before="0" w:after="20" w:line="240" w:lineRule="auto"/>
+            </w:pPr>
+            <w:r>
+              <w:rPr>
+                <w:rFonts w:ascii="Times New Roman" w:hAnsi="Times New Roman"/>
+                <w:b w:val="0"/>
+                <w:sz w:val="20"/>
+              </w:rPr>
+              <w:t>OM</w:t>
+            </w:r>
+          </w:p>
+        </w:tc>
+        <w:tc>
+          <w:tcPr>
+            <w:tcW w:type="dxa" w:w="7920"/>
+          </w:tcPr>
+          <w:p>
+            <w:pPr>
+              <w:spacing w:before="0" w:after="20" w:line="240" w:lineRule="auto"/>
+            </w:pPr>
+            <w:r>
+              <w:rPr>
+                <w:rFonts w:ascii="Times New Roman" w:hAnsi="Times New Roman"/>
+                <w:b w:val="0"/>
+                <w:sz w:val="20"/>
+              </w:rPr>
+              <w:t>Operating margin; operating profit / revenue</w:t>
+            </w:r>
+          </w:p>
+        </w:tc>
+      </w:tr>
+      <w:tr>
+        <w:trPr>
+          <w:cantSplit/>
+        </w:trPr>
+        <w:tc>
+          <w:tcPr>
+            <w:tcW w:type="dxa" w:w="1440"/>
+          </w:tcPr>
+          <w:p>
+            <w:pPr>
+              <w:spacing w:before="0" w:after="20" w:line="240" w:lineRule="auto"/>
+            </w:pPr>
+            <w:r>
+              <w:rPr>
+                <w:rFonts w:ascii="Times New Roman" w:hAnsi="Times New Roman"/>
+                <w:b w:val="0"/>
+                <w:sz w:val="20"/>
+              </w:rPr>
+              <w:t>PR</w:t>
+            </w:r>
+          </w:p>
+        </w:tc>
+        <w:tc>
+          <w:tcPr>
+            <w:tcW w:type="dxa" w:w="7920"/>
+          </w:tcPr>
+          <w:p>
+            <w:pPr>
+              <w:spacing w:before="0" w:after="20" w:line="240" w:lineRule="auto"/>
+            </w:pPr>
+            <w:r>
+              <w:rPr>
+                <w:rFonts w:ascii="Times New Roman" w:hAnsi="Times New Roman"/>
+                <w:b w:val="0"/>
+                <w:sz w:val="20"/>
+              </w:rPr>
+              <w:t>Precision–recall</w:t>
+            </w:r>
+          </w:p>
+        </w:tc>
+      </w:tr>
+      <w:tr>
+        <w:trPr>
+          <w:cantSplit/>
+        </w:trPr>
+        <w:tc>
+          <w:tcPr>
+            <w:tcW w:type="dxa" w:w="1440"/>
+          </w:tcPr>
+          <w:p>
+            <w:pPr>
+              <w:spacing w:before="0" w:after="20" w:line="240" w:lineRule="auto"/>
+            </w:pPr>
+            <w:r>
+              <w:rPr>
+                <w:rFonts w:ascii="Times New Roman" w:hAnsi="Times New Roman"/>
+                <w:b w:val="0"/>
+                <w:sz w:val="20"/>
+              </w:rPr>
+              <w:t>QR</w:t>
+            </w:r>
+          </w:p>
+        </w:tc>
+        <w:tc>
+          <w:tcPr>
+            <w:tcW w:type="dxa" w:w="7920"/>
+          </w:tcPr>
+          <w:p>
+            <w:pPr>
+              <w:spacing w:before="0" w:after="20" w:line="240" w:lineRule="auto"/>
+            </w:pPr>
+            <w:r>
+              <w:rPr>
+                <w:rFonts w:ascii="Times New Roman" w:hAnsi="Times New Roman"/>
+                <w:b w:val="0"/>
+                <w:sz w:val="20"/>
+              </w:rPr>
+              <w:t>Quick ratio; (current assets − inventory) / current liabilities</w:t>
+            </w:r>
+          </w:p>
+        </w:tc>
+      </w:tr>
+      <w:tr>
+        <w:trPr>
+          <w:cantSplit/>
+        </w:trPr>
+        <w:tc>
+          <w:tcPr>
+            <w:tcW w:type="dxa" w:w="1440"/>
+          </w:tcPr>
+          <w:p>
+            <w:pPr>
+              <w:spacing w:before="0" w:after="20" w:line="240" w:lineRule="auto"/>
+            </w:pPr>
+            <w:r>
+              <w:rPr>
+                <w:rFonts w:ascii="Times New Roman" w:hAnsi="Times New Roman"/>
+                <w:b w:val="0"/>
+                <w:sz w:val="20"/>
+              </w:rPr>
+              <w:t>ROC</w:t>
+            </w:r>
+          </w:p>
+        </w:tc>
+        <w:tc>
+          <w:tcPr>
+            <w:tcW w:type="dxa" w:w="7920"/>
+          </w:tcPr>
+          <w:p>
+            <w:pPr>
+              <w:spacing w:before="0" w:after="20" w:line="240" w:lineRule="auto"/>
+            </w:pPr>
+            <w:r>
+              <w:rPr>
+                <w:rFonts w:ascii="Times New Roman" w:hAnsi="Times New Roman"/>
+                <w:b w:val="0"/>
+                <w:sz w:val="20"/>
+              </w:rPr>
+              <w:t>Receiver operating characteristic</w:t>
+            </w:r>
+          </w:p>
+        </w:tc>
+      </w:tr>
+      <w:tr>
+        <w:trPr>
+          <w:cantSplit/>
+        </w:trPr>
+        <w:tc>
+          <w:tcPr>
+            <w:tcW w:type="dxa" w:w="1440"/>
+          </w:tcPr>
+          <w:p>
+            <w:pPr>
+              <w:spacing w:before="0" w:after="20" w:line="240" w:lineRule="auto"/>
+            </w:pPr>
+            <w:r>
+              <w:rPr>
+                <w:rFonts w:ascii="Times New Roman" w:hAnsi="Times New Roman"/>
+                <w:b w:val="0"/>
+                <w:sz w:val="20"/>
+              </w:rPr>
+              <w:t>SD</w:t>
+            </w:r>
+          </w:p>
+        </w:tc>
+        <w:tc>
+          <w:tcPr>
+            <w:tcW w:type="dxa" w:w="7920"/>
+          </w:tcPr>
+          <w:p>
+            <w:pPr>
+              <w:spacing w:before="0" w:after="20" w:line="240" w:lineRule="auto"/>
+            </w:pPr>
+            <w:r>
+              <w:rPr>
+                <w:rFonts w:ascii="Times New Roman" w:hAnsi="Times New Roman"/>
+                <w:b w:val="0"/>
+                <w:sz w:val="20"/>
+              </w:rPr>
+              <w:t>Standard deviation</w:t>
+            </w:r>
+          </w:p>
+        </w:tc>
+      </w:tr>
+      <w:tr>
+        <w:trPr>
+          <w:cantSplit/>
+        </w:trPr>
+        <w:tc>
+          <w:tcPr>
+            <w:tcW w:type="dxa" w:w="1440"/>
+          </w:tcPr>
+          <w:p>
+            <w:pPr>
+              <w:spacing w:before="0" w:after="20" w:line="240" w:lineRule="auto"/>
+            </w:pPr>
+            <w:r>
+              <w:rPr>
+                <w:rFonts w:ascii="Times New Roman" w:hAnsi="Times New Roman"/>
+                <w:b w:val="0"/>
+                <w:sz w:val="20"/>
+              </w:rPr>
+              <w:t>SHA-256</w:t>
+            </w:r>
+          </w:p>
+        </w:tc>
+        <w:tc>
+          <w:tcPr>
+            <w:tcW w:type="dxa" w:w="7920"/>
+          </w:tcPr>
+          <w:p>
+            <w:pPr>
+              <w:spacing w:before="0" w:after="20" w:line="240" w:lineRule="auto"/>
+            </w:pPr>
+            <w:r>
+              <w:rPr>
+                <w:rFonts w:ascii="Times New Roman" w:hAnsi="Times New Roman"/>
+                <w:b w:val="0"/>
+                <w:sz w:val="20"/>
+              </w:rPr>
+              <w:t>Secure Hash Algorithm; 256-bit file fingerprint</w:t>
+            </w:r>
+          </w:p>
+        </w:tc>
+      </w:tr>
+      <w:tr>
+        <w:trPr>
+          <w:cantSplit/>
+        </w:trPr>
+        <w:tc>
+          <w:tcPr>
+            <w:tcW w:type="dxa" w:w="1440"/>
+          </w:tcPr>
+          <w:p>
+            <w:pPr>
+              <w:spacing w:before="0" w:after="20" w:line="240" w:lineRule="auto"/>
+            </w:pPr>
+            <w:r>
+              <w:rPr>
+                <w:rFonts w:ascii="Times New Roman" w:hAnsi="Times New Roman"/>
+                <w:b w:val="0"/>
+                <w:sz w:val="20"/>
+              </w:rPr>
+              <w:t>ST</w:t>
+            </w:r>
+          </w:p>
+        </w:tc>
+        <w:tc>
+          <w:tcPr>
+            <w:tcW w:type="dxa" w:w="7920"/>
+          </w:tcPr>
+          <w:p>
+            <w:pPr>
+              <w:spacing w:before="0" w:after="20" w:line="240" w:lineRule="auto"/>
+            </w:pPr>
+            <w:r>
+              <w:rPr>
+                <w:rFonts w:ascii="Times New Roman" w:hAnsi="Times New Roman"/>
+                <w:b w:val="0"/>
+                <w:sz w:val="20"/>
+              </w:rPr>
+              <w:t>Special treatment; other risk warning</w:t>
+            </w:r>
+          </w:p>
+        </w:tc>
+      </w:tr>
+      <w:tr>
+        <w:trPr>
+          <w:cantSplit/>
+        </w:trPr>
+        <w:tc>
+          <w:tcPr>
+            <w:tcW w:type="dxa" w:w="1440"/>
+          </w:tcPr>
+          <w:p>
+            <w:pPr>
+              <w:spacing w:before="0" w:after="20" w:line="240" w:lineRule="auto"/>
+            </w:pPr>
+            <w:r>
+              <w:rPr>
+                <w:rFonts w:ascii="Times New Roman" w:hAnsi="Times New Roman"/>
+                <w:b w:val="0"/>
+                <w:sz w:val="20"/>
+              </w:rPr>
+              <w:t>*ST</w:t>
+            </w:r>
+          </w:p>
+        </w:tc>
+        <w:tc>
+          <w:tcPr>
+            <w:tcW w:type="dxa" w:w="7920"/>
+          </w:tcPr>
+          <w:p>
+            <w:pPr>
+              <w:spacing w:before="0" w:after="20" w:line="240" w:lineRule="auto"/>
+            </w:pPr>
+            <w:r>
+              <w:rPr>
+                <w:rFonts w:ascii="Times New Roman" w:hAnsi="Times New Roman"/>
+                <w:b w:val="0"/>
+                <w:sz w:val="20"/>
+              </w:rPr>
+              <w:t>Special treatment indicating delisting risk</w:t>
+            </w:r>
+          </w:p>
+        </w:tc>
+      </w:tr>
+      <w:tr>
+        <w:trPr>
+          <w:cantSplit/>
+        </w:trPr>
+        <w:tc>
+          <w:tcPr>
+            <w:tcW w:type="dxa" w:w="1440"/>
+          </w:tcPr>
+          <w:p>
+            <w:pPr>
+              <w:spacing w:before="0" w:after="20" w:line="240" w:lineRule="auto"/>
+            </w:pPr>
+            <w:r>
+              <w:rPr>
+                <w:rFonts w:ascii="Times New Roman" w:hAnsi="Times New Roman"/>
+                <w:b w:val="0"/>
+                <w:sz w:val="20"/>
+              </w:rPr>
+              <w:t>SVD</w:t>
+            </w:r>
+          </w:p>
+        </w:tc>
+        <w:tc>
+          <w:tcPr>
+            <w:tcW w:type="dxa" w:w="7920"/>
+          </w:tcPr>
+          <w:p>
+            <w:pPr>
+              <w:spacing w:before="0" w:after="20" w:line="240" w:lineRule="auto"/>
+            </w:pPr>
+            <w:r>
+              <w:rPr>
+                <w:rFonts w:ascii="Times New Roman" w:hAnsi="Times New Roman"/>
+                <w:b w:val="0"/>
+                <w:sz w:val="20"/>
+              </w:rPr>
+              <w:t>Singular value decomposition</w:t>
+            </w:r>
+          </w:p>
+        </w:tc>
+      </w:tr>
+      <w:tr>
+        <w:trPr>
+          <w:cantSplit/>
+        </w:trPr>
+        <w:tc>
+          <w:tcPr>
+            <w:tcW w:type="dxa" w:w="1440"/>
+          </w:tcPr>
+          <w:p>
+            <w:pPr>
+              <w:spacing w:before="0" w:after="20" w:line="240" w:lineRule="auto"/>
+            </w:pPr>
+            <w:r>
+              <w:rPr>
+                <w:rFonts w:ascii="Times New Roman" w:hAnsi="Times New Roman"/>
+                <w:b w:val="0"/>
+                <w:sz w:val="20"/>
+              </w:rPr>
+              <w:t>TF-IDF</w:t>
+            </w:r>
+          </w:p>
+        </w:tc>
+        <w:tc>
+          <w:tcPr>
+            <w:tcW w:type="dxa" w:w="7920"/>
+          </w:tcPr>
+          <w:p>
+            <w:pPr>
+              <w:spacing w:before="0" w:after="20" w:line="240" w:lineRule="auto"/>
+            </w:pPr>
+            <w:r>
+              <w:rPr>
+                <w:rFonts w:ascii="Times New Roman" w:hAnsi="Times New Roman"/>
+                <w:b w:val="0"/>
+                <w:sz w:val="20"/>
+              </w:rPr>
+              <w:t>Term frequency–inverse document frequency</w:t>
+            </w:r>
+          </w:p>
+        </w:tc>
+      </w:tr>
+      <w:tr>
+        <w:trPr>
+          <w:cantSplit/>
+        </w:trPr>
+        <w:tc>
+          <w:tcPr>
+            <w:tcW w:type="dxa" w:w="1440"/>
+          </w:tcPr>
+          <w:p>
+            <w:pPr>
+              <w:spacing w:before="0" w:after="20" w:line="240" w:lineRule="auto"/>
+            </w:pPr>
+            <w:r>
+              <w:rPr>
+                <w:rFonts w:ascii="Times New Roman" w:hAnsi="Times New Roman"/>
+                <w:b w:val="0"/>
+                <w:sz w:val="20"/>
+              </w:rPr>
+              <w:t>TN</w:t>
+            </w:r>
+          </w:p>
+        </w:tc>
+        <w:tc>
+          <w:tcPr>
+            <w:tcW w:type="dxa" w:w="7920"/>
+          </w:tcPr>
+          <w:p>
+            <w:pPr>
+              <w:spacing w:before="0" w:after="20" w:line="240" w:lineRule="auto"/>
+            </w:pPr>
+            <w:r>
+              <w:rPr>
+                <w:rFonts w:ascii="Times New Roman" w:hAnsi="Times New Roman"/>
+                <w:b w:val="0"/>
+                <w:sz w:val="20"/>
+              </w:rPr>
+              <w:t>True negatives; correctly classified non-events</w:t>
+            </w:r>
+          </w:p>
+        </w:tc>
+      </w:tr>
+      <w:tr>
+        <w:trPr>
+          <w:cantSplit/>
+        </w:trPr>
+        <w:tc>
+          <w:tcPr>
+            <w:tcW w:type="dxa" w:w="1440"/>
+          </w:tcPr>
+          <w:p>
+            <w:pPr>
+              <w:spacing w:before="0" w:after="20" w:line="240" w:lineRule="auto"/>
+            </w:pPr>
+            <w:r>
+              <w:rPr>
+                <w:rFonts w:ascii="Times New Roman" w:hAnsi="Times New Roman"/>
+                <w:b w:val="0"/>
+                <w:sz w:val="20"/>
+              </w:rPr>
+              <w:t>TP</w:t>
+            </w:r>
+          </w:p>
+        </w:tc>
+        <w:tc>
+          <w:tcPr>
+            <w:tcW w:type="dxa" w:w="7920"/>
+          </w:tcPr>
+          <w:p>
+            <w:pPr>
+              <w:spacing w:before="0" w:after="20" w:line="240" w:lineRule="auto"/>
+            </w:pPr>
+            <w:r>
+              <w:rPr>
+                <w:rFonts w:ascii="Times New Roman" w:hAnsi="Times New Roman"/>
+                <w:b w:val="0"/>
+                <w:sz w:val="20"/>
+              </w:rPr>
+              <w:t>True positives; correctly identified events</w:t>
+            </w:r>
+          </w:p>
+        </w:tc>
+      </w:tr>
+      <w:tr>
+        <w:trPr>
+          <w:cantSplit/>
+        </w:trPr>
+        <w:tc>
+          <w:tcPr>
+            <w:tcW w:type="dxa" w:w="1440"/>
+          </w:tcPr>
+          <w:p>
+            <w:pPr>
+              <w:spacing w:before="0" w:after="20" w:line="240" w:lineRule="auto"/>
+            </w:pPr>
+            <w:r>
+              <w:rPr>
+                <w:rFonts w:ascii="Times New Roman" w:hAnsi="Times New Roman"/>
+                <w:b w:val="0"/>
+                <w:sz w:val="20"/>
+              </w:rPr>
+              <w:t>Y</w:t>
+            </w:r>
+          </w:p>
+        </w:tc>
+        <w:tc>
+          <w:tcPr>
+            <w:tcW w:type="dxa" w:w="7920"/>
+          </w:tcPr>
+          <w:p>
+            <w:pPr>
+              <w:spacing w:before="0" w:after="20" w:line="240" w:lineRule="auto"/>
+            </w:pPr>
+            <w:r>
+              <w:rPr>
+                <w:rFonts w:ascii="Times New Roman" w:hAnsi="Times New Roman"/>
+                <w:b w:val="0"/>
+                <w:sz w:val="20"/>
+              </w:rPr>
+              <w:t>Calendar year of the May 1 prediction origin</w:t>
+            </w:r>
+          </w:p>
+        </w:tc>
+      </w:tr>
+    </w:tbl>
+    <w:p>
+      <w:pPr>
+        <w:spacing w:before="60" w:after="0"/>
+        <w:jc w:val="center"/>
+      </w:pPr>
+      <w:r>
+        <w:rPr>
+          <w:rFonts w:ascii="Times New Roman" w:hAnsi="Times New Roman"/>
+          <w:i/>
+          <w:sz w:val="22"/>
+        </w:rPr>
+        <w:t>Source: Terms used in the text, figures and tables, including Supplementary Table S1. Ratio denominators follow Table 2.</w:t>
       </w:r>
     </w:p>
     <w:sectPr>

</xml_diff>